<commit_message>
feat: parser-friendly defaults with named renders and keyword coverage
Render writes <Name>-<Kind>.docx (outputs.file_name, with name, kind, org, and
slug placeholders) and rotates a previous render of that name to a _bak1 suffix
together with its PDF, record, and layout renders, so the newest document always
carries the plain name and nothing is overwritten. An experience section can opt
into role_summaries, which carries each role's summary as a second line of the
role unit (unit.note in templates) so descriptors never sit in the role line.
Contact links render as stored, with their scheme. brief --coverage reports the
requirement keywords the visible profile lacks for the drafting step to judge;
doctor advises on section titles résumé parsers do not recognise. The example
templates and manifests carry the new defaults.
</commit_message>
<xml_diff>
--- a/examples/applicant/templates/resume/template.docx
+++ b/examples/applicant/templates/resume/template.docx
@@ -93,6 +93,24 @@
       </w:r>
       <w:r>
         <w:t xml:space="preserve">{{ unit.tail }}</w:t>
+      </w:r>
+    </w:p>
+    <w:p>
+      <w:r>
+        <w:t xml:space="preserve">{%p if unit.note %}</w:t>
+      </w:r>
+    </w:p>
+    <w:p>
+      <w:pPr>
+        <w:spacing w:after="20"/>
+      </w:pPr>
+      <w:r>
+        <w:t xml:space="preserve">{{ unit.note }}</w:t>
+      </w:r>
+    </w:p>
+    <w:p>
+      <w:r>
+        <w:t xml:space="preserve">{%p endif %}</w:t>
       </w:r>
     </w:p>
     <w:p>

</xml_diff>